<commit_message>
update notes, scribbles etc
</commit_message>
<xml_diff>
--- a/docs/notes/epi1.docx
+++ b/docs/notes/epi1.docx
@@ -15,7 +15,7 @@
         <w:pStyle w:val="Date"/>
       </w:pPr>
       <w:r>
-        <w:t xml:space="preserve">11 Sep 2023</w:t>
+        <w:t xml:space="preserve">8 Sep 2025</w:t>
       </w:r>
     </w:p>
     <w:bookmarkStart w:id="20" w:name="basics"/>
@@ -3584,7 +3584,7 @@
         <w:pStyle w:val="FirstParagraph"/>
       </w:pPr>
       <w:r>
-        <w:t xml:space="preserve">Last updated: 2025-08-21 16:05:34.055509</w:t>
+        <w:t xml:space="preserve">Last updated: 2025-09-08 20:16:56.560466</w:t>
       </w:r>
     </w:p>
     <w:bookmarkEnd w:id="80"/>

</xml_diff>